<commit_message>
Remove 6.2, the pod data-condition counts
Section 6 is now the revenue-model test data and the blocker behind it,
nothing else.

The counts went with it — workers without an expenditure organization,
projects without a manager, projects not tracking time, projects with no
chargeable task. Also gone is the note that a usable test project needs
all five conditions clear at the same time, since it read off those
figures. Say if that one is worth keeping and I will fold it into 6.1
without the numbers.

The revenue-model blocker is untouched and stands on its own: REVENUE_MODEL
and LEAVE_LOSS_FLAG are read from nowhere and null everywhere, so
leave-loss cannot fire for any project. That was stated in the 6.1 note
already, not only in the deleted table.

The counts remain in doc/Integration_Data_Sourcing_Matrix.md if they are
wanted later.

Word copy regenerated.
</commit_message>
<xml_diff>
--- a/doc/O2C_Time_Scope_and_Integration.docx
+++ b/doc/O2C_Time_Scope_and_Integration.docx
@@ -8069,387 +8069,6 @@
           <w:sz w:val="19"/>
         </w:rPr>
         <w:t xml:space="preserve">, because the rule requires a value that nothing sets. </w:t>
-      </w:r>
-    </w:p>
-    <w:p>
-      <w:pPr>
-        <w:pStyle w:val="Heading2"/>
-      </w:pPr>
-      <w:r>
-        <w:t>6.2 Conditions in Fusion that block time entry</w:t>
-      </w:r>
-    </w:p>
-    <w:p>
-      <w:r>
-        <w:rPr>
-          <w:b w:val="0"/>
-          <w:i w:val="0"/>
-          <w:color w:val="55657A"/>
-        </w:rPr>
-        <w:t>Measured on the reference pod, 01–02 Aug 2026. These are data to correct rather than defects in the module — but each one stops somebody entering or costing time, and each has to be clear for the projects chosen as test data above.</w:t>
-      </w:r>
-    </w:p>
-    <w:tbl>
-      <w:tblPr>
-        <w:tblStyle w:val="TableGrid"/>
-        <w:tblW w:type="auto" w:w="0"/>
-        <w:jc w:val="center"/>
-        <w:tblLook w:firstColumn="1" w:firstRow="1" w:lastColumn="0" w:lastRow="0" w:noHBand="0" w:noVBand="1" w:val="04A0"/>
-      </w:tblPr>
-      <w:tblGrid>
-        <w:gridCol w:w="3264"/>
-        <w:gridCol w:w="3264"/>
-        <w:gridCol w:w="3264"/>
-      </w:tblGrid>
-      <w:tr>
-        <w:tc>
-          <w:tcPr>
-            <w:tcW w:type="dxa" w:w="3264"/>
-            <w:shd w:val="clear" w:fill="F1F3F6"/>
-          </w:tcPr>
-          <w:p>
-            <w:pPr>
-              <w:spacing w:after="40"/>
-            </w:pPr>
-            <w:r/>
-            <w:r>
-              <w:rPr>
-                <w:b/>
-                <w:i w:val="0"/>
-              </w:rPr>
-              <w:t>Condition</w:t>
-            </w:r>
-          </w:p>
-        </w:tc>
-        <w:tc>
-          <w:tcPr>
-            <w:tcW w:type="dxa" w:w="3264"/>
-            <w:shd w:val="clear" w:fill="F1F3F6"/>
-          </w:tcPr>
-          <w:p>
-            <w:pPr>
-              <w:spacing w:after="40"/>
-            </w:pPr>
-            <w:r/>
-            <w:r>
-              <w:rPr>
-                <w:b/>
-                <w:i w:val="0"/>
-              </w:rPr>
-              <w:t>Measured</w:t>
-            </w:r>
-          </w:p>
-        </w:tc>
-        <w:tc>
-          <w:tcPr>
-            <w:tcW w:type="dxa" w:w="3264"/>
-            <w:shd w:val="clear" w:fill="F1F3F6"/>
-          </w:tcPr>
-          <w:p>
-            <w:pPr>
-              <w:spacing w:after="40"/>
-            </w:pPr>
-            <w:r/>
-            <w:r>
-              <w:rPr>
-                <w:b/>
-                <w:i w:val="0"/>
-              </w:rPr>
-              <w:t>Effect</w:t>
-            </w:r>
-          </w:p>
-        </w:tc>
-      </w:tr>
-      <w:tr>
-        <w:tc>
-          <w:tcPr>
-            <w:tcW w:type="dxa" w:w="3264"/>
-          </w:tcPr>
-          <w:p>
-            <w:pPr>
-              <w:spacing w:after="40"/>
-            </w:pPr>
-            <w:r/>
-            <w:r>
-              <w:rPr>
-                <w:b w:val="0"/>
-                <w:i w:val="0"/>
-              </w:rPr>
-              <w:t>Workers with no expenditure organization</w:t>
-            </w:r>
-          </w:p>
-        </w:tc>
-        <w:tc>
-          <w:tcPr>
-            <w:tcW w:type="dxa" w:w="3264"/>
-          </w:tcPr>
-          <w:p>
-            <w:pPr>
-              <w:spacing w:after="40"/>
-            </w:pPr>
-            <w:r/>
-            <w:r>
-              <w:rPr>
-                <w:b w:val="0"/>
-                <w:i w:val="0"/>
-              </w:rPr>
-              <w:t>1,229 of 5,988</w:t>
-            </w:r>
-          </w:p>
-        </w:tc>
-        <w:tc>
-          <w:tcPr>
-            <w:tcW w:type="dxa" w:w="3264"/>
-          </w:tcPr>
-          <w:p>
-            <w:pPr>
-              <w:spacing w:after="40"/>
-            </w:pPr>
-            <w:r/>
-            <w:r>
-              <w:rPr>
-                <w:b w:val="0"/>
-                <w:i w:val="0"/>
-              </w:rPr>
-              <w:t>POET cannot resolve, so nothing can be costed for them</w:t>
-            </w:r>
-          </w:p>
-        </w:tc>
-      </w:tr>
-      <w:tr>
-        <w:tc>
-          <w:tcPr>
-            <w:tcW w:type="dxa" w:w="3264"/>
-          </w:tcPr>
-          <w:p>
-            <w:pPr>
-              <w:spacing w:after="40"/>
-            </w:pPr>
-            <w:r/>
-            <w:r>
-              <w:rPr>
-                <w:b w:val="0"/>
-                <w:i w:val="0"/>
-              </w:rPr>
-              <w:t>Projects with no project manager</w:t>
-            </w:r>
-          </w:p>
-        </w:tc>
-        <w:tc>
-          <w:tcPr>
-            <w:tcW w:type="dxa" w:w="3264"/>
-          </w:tcPr>
-          <w:p>
-            <w:pPr>
-              <w:spacing w:after="40"/>
-            </w:pPr>
-            <w:r/>
-            <w:r>
-              <w:rPr>
-                <w:b w:val="0"/>
-                <w:i w:val="0"/>
-              </w:rPr>
-              <w:t>237 of 424</w:t>
-            </w:r>
-          </w:p>
-        </w:tc>
-        <w:tc>
-          <w:tcPr>
-            <w:tcW w:type="dxa" w:w="3264"/>
-          </w:tcPr>
-          <w:p>
-            <w:pPr>
-              <w:spacing w:after="40"/>
-            </w:pPr>
-            <w:r/>
-            <w:r>
-              <w:rPr>
-                <w:b w:val="0"/>
-                <w:i w:val="0"/>
-              </w:rPr>
-              <w:t>approval has no routing target</w:t>
-            </w:r>
-          </w:p>
-        </w:tc>
-      </w:tr>
-      <w:tr>
-        <w:tc>
-          <w:tcPr>
-            <w:tcW w:type="dxa" w:w="3264"/>
-          </w:tcPr>
-          <w:p>
-            <w:pPr>
-              <w:spacing w:after="40"/>
-            </w:pPr>
-            <w:r/>
-            <w:r>
-              <w:rPr>
-                <w:b w:val="0"/>
-                <w:i w:val="0"/>
-              </w:rPr>
-              <w:t>Projects marked to track time</w:t>
-            </w:r>
-          </w:p>
-        </w:tc>
-        <w:tc>
-          <w:tcPr>
-            <w:tcW w:type="dxa" w:w="3264"/>
-          </w:tcPr>
-          <w:p>
-            <w:pPr>
-              <w:spacing w:after="40"/>
-            </w:pPr>
-            <w:r/>
-            <w:r>
-              <w:rPr>
-                <w:b w:val="0"/>
-                <w:i w:val="0"/>
-              </w:rPr>
-              <w:t>only 48 of 424</w:t>
-            </w:r>
-          </w:p>
-        </w:tc>
-        <w:tc>
-          <w:tcPr>
-            <w:tcW w:type="dxa" w:w="3264"/>
-          </w:tcPr>
-          <w:p>
-            <w:pPr>
-              <w:spacing w:after="40"/>
-            </w:pPr>
-            <w:r/>
-            <w:r>
-              <w:rPr>
-                <w:b w:val="0"/>
-                <w:i w:val="0"/>
-              </w:rPr>
-              <w:t>the rest are invisible to time entry — confirm intended</w:t>
-            </w:r>
-          </w:p>
-        </w:tc>
-      </w:tr>
-      <w:tr>
-        <w:tc>
-          <w:tcPr>
-            <w:tcW w:type="dxa" w:w="3264"/>
-          </w:tcPr>
-          <w:p>
-            <w:pPr>
-              <w:spacing w:after="40"/>
-            </w:pPr>
-            <w:r/>
-            <w:r>
-              <w:rPr>
-                <w:b w:val="0"/>
-                <w:i w:val="0"/>
-              </w:rPr>
-              <w:t>Projects with no chargeable WBS task</w:t>
-            </w:r>
-          </w:p>
-        </w:tc>
-        <w:tc>
-          <w:tcPr>
-            <w:tcW w:type="dxa" w:w="3264"/>
-          </w:tcPr>
-          <w:p>
-            <w:pPr>
-              <w:spacing w:after="40"/>
-            </w:pPr>
-            <w:r/>
-            <w:r>
-              <w:rPr>
-                <w:b w:val="0"/>
-                <w:i w:val="0"/>
-              </w:rPr>
-              <w:t>15 projects, 42 allocations</w:t>
-            </w:r>
-          </w:p>
-        </w:tc>
-        <w:tc>
-          <w:tcPr>
-            <w:tcW w:type="dxa" w:w="3264"/>
-          </w:tcPr>
-          <w:p>
-            <w:pPr>
-              <w:spacing w:after="40"/>
-            </w:pPr>
-            <w:r/>
-            <w:r>
-              <w:rPr>
-                <w:b w:val="0"/>
-                <w:i w:val="0"/>
-              </w:rPr>
-              <w:t>nothing to prepopulate or charge against</w:t>
-            </w:r>
-          </w:p>
-        </w:tc>
-      </w:tr>
-      <w:tr>
-        <w:tc>
-          <w:tcPr>
-            <w:tcW w:type="dxa" w:w="3264"/>
-          </w:tcPr>
-          <w:p>
-            <w:pPr>
-              <w:spacing w:after="40"/>
-            </w:pPr>
-            <w:r/>
-            <w:r>
-              <w:rPr>
-                <w:b w:val="0"/>
-                <w:i w:val="0"/>
-              </w:rPr>
-              <w:t>Projects with a revenue model set</w:t>
-            </w:r>
-          </w:p>
-        </w:tc>
-        <w:tc>
-          <w:tcPr>
-            <w:tcW w:type="dxa" w:w="3264"/>
-          </w:tcPr>
-          <w:p>
-            <w:pPr>
-              <w:spacing w:after="40"/>
-            </w:pPr>
-            <w:r/>
-            <w:r>
-              <w:rPr>
-                <w:b/>
-                <w:i w:val="0"/>
-              </w:rPr>
-              <w:t>none</w:t>
-            </w:r>
-          </w:p>
-        </w:tc>
-        <w:tc>
-          <w:tcPr>
-            <w:tcW w:type="dxa" w:w="3264"/>
-          </w:tcPr>
-          <w:p>
-            <w:pPr>
-              <w:spacing w:after="40"/>
-            </w:pPr>
-            <w:r/>
-            <w:r>
-              <w:rPr>
-                <w:b w:val="0"/>
-                <w:i w:val="0"/>
-              </w:rPr>
-              <w:t>leave-loss can never fire — see the blocker above</w:t>
-            </w:r>
-          </w:p>
-        </w:tc>
-      </w:tr>
-    </w:tbl>
-    <w:p/>
-    <w:p>
-      <w:r>
-        <w:rPr>
-          <w:b w:val="0"/>
-          <w:i w:val="0"/>
-          <w:color w:val="55657A"/>
-        </w:rPr>
-        <w:t>A useful test project therefore needs all five clear at once: a manager, track-time enabled, at least one chargeable WBS task, an allocated resource whose expenditure organization is set, and a revenue model. That combination is scarcer than any single figure above suggests, which is why choosing the projects deliberately matters more than the counts.</w:t>
       </w:r>
     </w:p>
     <w:p/>

</xml_diff>

<commit_message>
few changes in docs and alignment
</commit_message>
<xml_diff>
--- a/doc/O2C_Time_Scope_and_Integration.docx
+++ b/doc/O2C_Time_Scope_and_Integration.docx
@@ -5314,8 +5314,8 @@
         <w:tblLook w:val="04A0" w:firstRow="1" w:lastRow="0" w:firstColumn="1" w:lastColumn="0" w:noHBand="0" w:noVBand="1"/>
       </w:tblPr>
       <w:tblGrid>
-        <w:gridCol w:w="3264"/>
-        <w:gridCol w:w="3264"/>
+        <w:gridCol w:w="429"/>
+        <w:gridCol w:w="6102"/>
         <w:gridCol w:w="3264"/>
       </w:tblGrid>
       <w:tr>
@@ -5324,7 +5324,7 @@
         </w:trPr>
         <w:tc>
           <w:tcPr>
-            <w:tcW w:w="3264" w:type="dxa"/>
+            <w:tcW w:w="426" w:type="dxa"/>
             <w:shd w:val="clear" w:color="auto" w:fill="F1F3F6"/>
           </w:tcPr>
           <w:p>
@@ -5341,7 +5341,7 @@
         </w:tc>
         <w:tc>
           <w:tcPr>
-            <w:tcW w:w="3264" w:type="dxa"/>
+            <w:tcW w:w="6102" w:type="dxa"/>
             <w:shd w:val="clear" w:color="auto" w:fill="F1F3F6"/>
           </w:tcPr>
           <w:p>
@@ -5380,7 +5380,7 @@
         </w:trPr>
         <w:tc>
           <w:tcPr>
-            <w:tcW w:w="3264" w:type="dxa"/>
+            <w:tcW w:w="426" w:type="dxa"/>
           </w:tcPr>
           <w:p>
             <w:pPr>
@@ -5393,7 +5393,7 @@
         </w:tc>
         <w:tc>
           <w:tcPr>
-            <w:tcW w:w="3264" w:type="dxa"/>
+            <w:tcW w:w="6102" w:type="dxa"/>
           </w:tcPr>
           <w:p>
             <w:pPr>
@@ -5430,7 +5430,7 @@
         </w:trPr>
         <w:tc>
           <w:tcPr>
-            <w:tcW w:w="3264" w:type="dxa"/>
+            <w:tcW w:w="426" w:type="dxa"/>
           </w:tcPr>
           <w:p>
             <w:pPr>
@@ -5443,7 +5443,7 @@
         </w:tc>
         <w:tc>
           <w:tcPr>
-            <w:tcW w:w="3264" w:type="dxa"/>
+            <w:tcW w:w="6102" w:type="dxa"/>
           </w:tcPr>
           <w:p>
             <w:pPr>
@@ -5480,7 +5480,7 @@
         </w:trPr>
         <w:tc>
           <w:tcPr>
-            <w:tcW w:w="3264" w:type="dxa"/>
+            <w:tcW w:w="426" w:type="dxa"/>
           </w:tcPr>
           <w:p>
             <w:pPr>
@@ -5493,7 +5493,7 @@
         </w:tc>
         <w:tc>
           <w:tcPr>
-            <w:tcW w:w="3264" w:type="dxa"/>
+            <w:tcW w:w="6102" w:type="dxa"/>
           </w:tcPr>
           <w:p>
             <w:pPr>
@@ -5530,7 +5530,7 @@
         </w:trPr>
         <w:tc>
           <w:tcPr>
-            <w:tcW w:w="3264" w:type="dxa"/>
+            <w:tcW w:w="426" w:type="dxa"/>
           </w:tcPr>
           <w:p>
             <w:pPr>
@@ -5543,7 +5543,7 @@
         </w:tc>
         <w:tc>
           <w:tcPr>
-            <w:tcW w:w="3264" w:type="dxa"/>
+            <w:tcW w:w="6102" w:type="dxa"/>
           </w:tcPr>
           <w:p>
             <w:pPr>
@@ -5580,7 +5580,7 @@
         </w:trPr>
         <w:tc>
           <w:tcPr>
-            <w:tcW w:w="3264" w:type="dxa"/>
+            <w:tcW w:w="426" w:type="dxa"/>
           </w:tcPr>
           <w:p>
             <w:pPr>
@@ -5593,7 +5593,7 @@
         </w:tc>
         <w:tc>
           <w:tcPr>
-            <w:tcW w:w="3264" w:type="dxa"/>
+            <w:tcW w:w="6102" w:type="dxa"/>
           </w:tcPr>
           <w:p>
             <w:pPr>
@@ -5633,7 +5633,7 @@
         </w:trPr>
         <w:tc>
           <w:tcPr>
-            <w:tcW w:w="3264" w:type="dxa"/>
+            <w:tcW w:w="426" w:type="dxa"/>
           </w:tcPr>
           <w:p>
             <w:pPr>
@@ -5646,7 +5646,7 @@
         </w:tc>
         <w:tc>
           <w:tcPr>
-            <w:tcW w:w="3264" w:type="dxa"/>
+            <w:tcW w:w="6102" w:type="dxa"/>
           </w:tcPr>
           <w:p>
             <w:pPr>
@@ -5677,7 +5677,7 @@
         </w:trPr>
         <w:tc>
           <w:tcPr>
-            <w:tcW w:w="3264" w:type="dxa"/>
+            <w:tcW w:w="426" w:type="dxa"/>
           </w:tcPr>
           <w:p>
             <w:pPr>
@@ -5690,7 +5690,7 @@
         </w:tc>
         <w:tc>
           <w:tcPr>
-            <w:tcW w:w="3264" w:type="dxa"/>
+            <w:tcW w:w="6102" w:type="dxa"/>
           </w:tcPr>
           <w:p>
             <w:pPr>
@@ -5730,7 +5730,7 @@
         </w:trPr>
         <w:tc>
           <w:tcPr>
-            <w:tcW w:w="3264" w:type="dxa"/>
+            <w:tcW w:w="426" w:type="dxa"/>
           </w:tcPr>
           <w:p>
             <w:pPr>
@@ -5743,7 +5743,7 @@
         </w:tc>
         <w:tc>
           <w:tcPr>
-            <w:tcW w:w="3264" w:type="dxa"/>
+            <w:tcW w:w="6102" w:type="dxa"/>
           </w:tcPr>
           <w:p>
             <w:pPr>
@@ -5792,7 +5792,7 @@
         </w:trPr>
         <w:tc>
           <w:tcPr>
-            <w:tcW w:w="3264" w:type="dxa"/>
+            <w:tcW w:w="426" w:type="dxa"/>
           </w:tcPr>
           <w:p>
             <w:pPr>
@@ -5805,7 +5805,7 @@
         </w:tc>
         <w:tc>
           <w:tcPr>
-            <w:tcW w:w="3264" w:type="dxa"/>
+            <w:tcW w:w="6102" w:type="dxa"/>
           </w:tcPr>
           <w:p>
             <w:pPr>
@@ -5828,7 +5828,6 @@
                 <w:rFonts w:ascii="Consolas" w:hAnsi="Consolas"/>
                 <w:sz w:val="18"/>
               </w:rPr>
-              <w:lastRenderedPageBreak/>
               <w:t>ExpenditureBatch</w:t>
             </w:r>
             <w:r>
@@ -5845,7 +5844,6 @@
               <w:spacing w:after="40"/>
             </w:pPr>
             <w:r>
-              <w:lastRenderedPageBreak/>
               <w:t>Fusion configuration</w:t>
             </w:r>
           </w:p>
@@ -5857,7 +5855,7 @@
         </w:trPr>
         <w:tc>
           <w:tcPr>
-            <w:tcW w:w="3264" w:type="dxa"/>
+            <w:tcW w:w="426" w:type="dxa"/>
           </w:tcPr>
           <w:p>
             <w:pPr>
@@ -5870,7 +5868,7 @@
         </w:tc>
         <w:tc>
           <w:tcPr>
-            <w:tcW w:w="3264" w:type="dxa"/>
+            <w:tcW w:w="6102" w:type="dxa"/>
           </w:tcPr>
           <w:p>
             <w:pPr>
@@ -5901,7 +5899,7 @@
         </w:trPr>
         <w:tc>
           <w:tcPr>
-            <w:tcW w:w="3264" w:type="dxa"/>
+            <w:tcW w:w="426" w:type="dxa"/>
           </w:tcPr>
           <w:p>
             <w:pPr>
@@ -5914,7 +5912,7 @@
         </w:tc>
         <w:tc>
           <w:tcPr>
-            <w:tcW w:w="3264" w:type="dxa"/>
+            <w:tcW w:w="6102" w:type="dxa"/>
           </w:tcPr>
           <w:p>
             <w:pPr>
@@ -5954,7 +5952,7 @@
         </w:trPr>
         <w:tc>
           <w:tcPr>
-            <w:tcW w:w="3264" w:type="dxa"/>
+            <w:tcW w:w="426" w:type="dxa"/>
           </w:tcPr>
           <w:p>
             <w:pPr>
@@ -5967,7 +5965,7 @@
         </w:tc>
         <w:tc>
           <w:tcPr>
-            <w:tcW w:w="3264" w:type="dxa"/>
+            <w:tcW w:w="6102" w:type="dxa"/>
           </w:tcPr>
           <w:p>
             <w:pPr>
@@ -6018,7 +6016,7 @@
         </w:trPr>
         <w:tc>
           <w:tcPr>
-            <w:tcW w:w="3264" w:type="dxa"/>
+            <w:tcW w:w="426" w:type="dxa"/>
           </w:tcPr>
           <w:p>
             <w:pPr>
@@ -6031,7 +6029,7 @@
         </w:tc>
         <w:tc>
           <w:tcPr>
-            <w:tcW w:w="3264" w:type="dxa"/>
+            <w:tcW w:w="6102" w:type="dxa"/>
           </w:tcPr>
           <w:p>
             <w:pPr>
@@ -6062,7 +6060,7 @@
         </w:trPr>
         <w:tc>
           <w:tcPr>
-            <w:tcW w:w="3264" w:type="dxa"/>
+            <w:tcW w:w="426" w:type="dxa"/>
           </w:tcPr>
           <w:p>
             <w:pPr>
@@ -6075,7 +6073,7 @@
         </w:tc>
         <w:tc>
           <w:tcPr>
-            <w:tcW w:w="3264" w:type="dxa"/>
+            <w:tcW w:w="6102" w:type="dxa"/>
           </w:tcPr>
           <w:p>
             <w:pPr>
@@ -6106,7 +6104,7 @@
         </w:trPr>
         <w:tc>
           <w:tcPr>
-            <w:tcW w:w="3264" w:type="dxa"/>
+            <w:tcW w:w="426" w:type="dxa"/>
           </w:tcPr>
           <w:p>
             <w:pPr>
@@ -6119,7 +6117,7 @@
         </w:tc>
         <w:tc>
           <w:tcPr>
-            <w:tcW w:w="3264" w:type="dxa"/>
+            <w:tcW w:w="6102" w:type="dxa"/>
           </w:tcPr>
           <w:p>
             <w:pPr>
@@ -6150,7 +6148,7 @@
         </w:trPr>
         <w:tc>
           <w:tcPr>
-            <w:tcW w:w="3264" w:type="dxa"/>
+            <w:tcW w:w="426" w:type="dxa"/>
           </w:tcPr>
           <w:p>
             <w:pPr>
@@ -6163,7 +6161,7 @@
         </w:tc>
         <w:tc>
           <w:tcPr>
-            <w:tcW w:w="3264" w:type="dxa"/>
+            <w:tcW w:w="6102" w:type="dxa"/>
           </w:tcPr>
           <w:p>
             <w:pPr>
@@ -6194,20 +6192,21 @@
         </w:trPr>
         <w:tc>
           <w:tcPr>
-            <w:tcW w:w="3264" w:type="dxa"/>
-          </w:tcPr>
-          <w:p>
-            <w:pPr>
-              <w:spacing w:after="40"/>
-            </w:pPr>
-            <w:r>
+            <w:tcW w:w="426" w:type="dxa"/>
+          </w:tcPr>
+          <w:p>
+            <w:pPr>
+              <w:spacing w:after="40"/>
+            </w:pPr>
+            <w:r>
+              <w:lastRenderedPageBreak/>
               <w:t>17</w:t>
             </w:r>
           </w:p>
         </w:tc>
         <w:tc>
           <w:tcPr>
-            <w:tcW w:w="3264" w:type="dxa"/>
+            <w:tcW w:w="6102" w:type="dxa"/>
           </w:tcPr>
           <w:p>
             <w:pPr>
@@ -6272,7 +6271,7 @@
         </w:trPr>
         <w:tc>
           <w:tcPr>
-            <w:tcW w:w="3264" w:type="dxa"/>
+            <w:tcW w:w="426" w:type="dxa"/>
           </w:tcPr>
           <w:p>
             <w:pPr>
@@ -6285,7 +6284,7 @@
         </w:tc>
         <w:tc>
           <w:tcPr>
-            <w:tcW w:w="3264" w:type="dxa"/>
+            <w:tcW w:w="6102" w:type="dxa"/>
           </w:tcPr>
           <w:p>
             <w:pPr>
@@ -6337,7 +6336,7 @@
         </w:trPr>
         <w:tc>
           <w:tcPr>
-            <w:tcW w:w="3264" w:type="dxa"/>
+            <w:tcW w:w="426" w:type="dxa"/>
           </w:tcPr>
           <w:p>
             <w:pPr>
@@ -6350,7 +6349,7 @@
         </w:tc>
         <w:tc>
           <w:tcPr>
-            <w:tcW w:w="3264" w:type="dxa"/>
+            <w:tcW w:w="6102" w:type="dxa"/>
           </w:tcPr>
           <w:p>
             <w:pPr>
@@ -6396,7 +6395,7 @@
         </w:trPr>
         <w:tc>
           <w:tcPr>
-            <w:tcW w:w="3264" w:type="dxa"/>
+            <w:tcW w:w="426" w:type="dxa"/>
           </w:tcPr>
           <w:p>
             <w:pPr>
@@ -6409,7 +6408,7 @@
         </w:tc>
         <w:tc>
           <w:tcPr>
-            <w:tcW w:w="3264" w:type="dxa"/>
+            <w:tcW w:w="6102" w:type="dxa"/>
           </w:tcPr>
           <w:p>
             <w:pPr>
@@ -6466,7 +6465,7 @@
         </w:trPr>
         <w:tc>
           <w:tcPr>
-            <w:tcW w:w="3264" w:type="dxa"/>
+            <w:tcW w:w="426" w:type="dxa"/>
           </w:tcPr>
           <w:p>
             <w:pPr>
@@ -6479,7 +6478,7 @@
         </w:tc>
         <w:tc>
           <w:tcPr>
-            <w:tcW w:w="3264" w:type="dxa"/>
+            <w:tcW w:w="6102" w:type="dxa"/>
           </w:tcPr>
           <w:p>
             <w:pPr>
@@ -6809,6 +6808,7 @@
         <w:rPr>
           <w:color w:val="55657A"/>
         </w:rPr>
+        <w:lastRenderedPageBreak/>
         <w:t xml:space="preserve">The distinction matters because the leave-loss refusal is explicit: coverage applies </w:t>
       </w:r>
       <w:r>
@@ -6971,14 +6971,7 @@
         <w:rPr>
           <w:sz w:val="19"/>
         </w:rPr>
-        <w:t xml:space="preserve"> A small maintained mapping of project number to revenue model and leave-loss flag. </w:t>
-      </w:r>
-      <w:r>
-        <w:rPr>
-          <w:sz w:val="19"/>
-        </w:rPr>
-        <w:lastRenderedPageBreak/>
-        <w:t xml:space="preserve">Works, but it is a second place to keep current, and a project whose commercial basis changes in Fusion will not change here. </w:t>
+        <w:t xml:space="preserve"> A small maintained mapping of project number to revenue model and leave-loss flag. Works, but it is a second place to keep current, and a project whose commercial basis changes in Fusion will not change here. </w:t>
       </w:r>
       <w:r>
         <w:rPr>
@@ -7047,6 +7040,7 @@
         <w:pStyle w:val="Heading3"/>
       </w:pPr>
       <w:r>
+        <w:lastRenderedPageBreak/>
         <w:t>Flow 1 — inbound: what is read, and what it feeds</w:t>
       </w:r>
     </w:p>

</xml_diff>

<commit_message>
Word edits from the review pass
</commit_message>
<xml_diff>
--- a/doc/O2C_Time_Scope_and_Integration.docx
+++ b/doc/O2C_Time_Scope_and_Integration.docx
@@ -74,7 +74,10 @@
         <w:t>All reference data read live from Fusion</w:t>
       </w:r>
       <w:r>
-        <w:t xml:space="preserve"> at page load — project, POET, task, allocation, rate, work schedule, shift pattern, calendar and absence (2).</w:t>
+        <w:t xml:space="preserve"> at page load — project, POET, task, allocation, rate, work schedule, shift pattern, calendar and absence (</w:t>
+      </w:r>
+      <w:r>
+        <w:t>2).</w:t>
       </w:r>
     </w:p>
     <w:p>
@@ -102,7 +105,10 @@
         <w:t>Prepopulation</w:t>
       </w:r>
       <w:r>
-        <w:t xml:space="preserve"> from allocation percentage and from approved absences (3.1).</w:t>
+        <w:t xml:space="preserve"> from allocation percentage and from approved absences (</w:t>
+      </w:r>
+      <w:r>
+        <w:t>3.1).</w:t>
       </w:r>
     </w:p>
     <w:p>
@@ -116,7 +122,10 @@
         <w:t>Approval</w:t>
       </w:r>
       <w:r>
-        <w:t xml:space="preserve"> — day, week and project-month, with reason and remarks on rejection, and an undo for a decision taken by mistake.</w:t>
+        <w:t xml:space="preserve"> — day, week and project-month, with reason and remarks on reject</w:t>
+      </w:r>
+      <w:r>
+        <w:t>ion, and an undo for a decision taken by mistake.</w:t>
       </w:r>
     </w:p>
     <w:p>
@@ -254,7 +263,10 @@
       </w:r>
       <w:proofErr w:type="spellEnd"/>
       <w:r>
-        <w:t xml:space="preserve"> (4).</w:t>
+        <w:t xml:space="preserve"> (</w:t>
+      </w:r>
+      <w:r>
+        <w:t>4).</w:t>
       </w:r>
     </w:p>
     <w:p>
@@ -873,6 +885,8 @@
             </w:r>
             <w:r>
               <w:br/>
+            </w:r>
+            <w:r>
               <w:t>expenditure organization from the person’s assignment</w:t>
             </w:r>
           </w:p>
@@ -1155,6 +1169,8 @@
             </w:r>
             <w:r>
               <w:br/>
+            </w:r>
+            <w:r>
               <w:t xml:space="preserve">BIP </w:t>
             </w:r>
             <w:r>
@@ -1251,6 +1267,8 @@
             </w:r>
             <w:r>
               <w:br/>
+            </w:r>
+            <w:r>
               <w:t xml:space="preserve">BIP </w:t>
             </w:r>
             <w:r>
@@ -1322,6 +1340,8 @@
             </w:r>
             <w:r>
               <w:br/>
+            </w:r>
+            <w:r>
               <w:t>for the person, for the dates on screen</w:t>
             </w:r>
           </w:p>
@@ -1343,6 +1363,8 @@
             </w:r>
             <w:r>
               <w:br/>
+            </w:r>
+            <w:r>
               <w:t>filtered by person and by the date range being viewed</w:t>
             </w:r>
           </w:p>
@@ -4131,8 +4153,15 @@
             <w:r>
               <w:rPr>
                 <w:b/>
-              </w:rPr>
-              <w:t>On hold.</w:t>
+                <w:color w:val="EE0000"/>
+              </w:rPr>
+              <w:t>On hold</w:t>
+            </w:r>
+            <w:r>
+              <w:rPr>
+                <w:b/>
+              </w:rPr>
+              <w:t>.</w:t>
             </w:r>
             <w:r>
               <w:t xml:space="preserve"> Nothing is sent and the column stays </w:t>
@@ -4190,6 +4219,11 @@
           <w:sz w:val="19"/>
         </w:rPr>
         <w:br/>
+      </w:r>
+      <w:r>
+        <w:rPr>
+          <w:sz w:val="19"/>
+        </w:rPr>
         <w:t xml:space="preserve"> Worth knowing before the structure is agreed — the interface behind </w:t>
       </w:r>
       <w:r>
@@ -4294,6 +4328,11 @@
           <w:sz w:val="19"/>
         </w:rPr>
         <w:br/>
+      </w:r>
+      <w:r>
+        <w:rPr>
+          <w:sz w:val="19"/>
+        </w:rPr>
         <w:t xml:space="preserve"> Which raises the question to settle </w:t>
       </w:r>
       <w:r>
@@ -6694,6 +6733,8 @@
             </w:r>
             <w:r>
               <w:br/>
+            </w:r>
+            <w:r>
               <w:t>Time &amp; Material</w:t>
             </w:r>
           </w:p>
@@ -6745,6 +6786,8 @@
             </w:r>
             <w:r>
               <w:br/>
+            </w:r>
+            <w:r>
               <w:t>Fixed Capacity</w:t>
             </w:r>
           </w:p>
@@ -6963,6 +7006,11 @@
           <w:sz w:val="19"/>
         </w:rPr>
         <w:br/>
+      </w:r>
+      <w:r>
+        <w:rPr>
+          <w:sz w:val="19"/>
+        </w:rPr>
         <w:t xml:space="preserve"> So data cannot be “prepared for each revenue model” until we decide where the value lives. Two options: </w:t>
       </w:r>
       <w:r>
@@ -7039,6 +7087,11 @@
           <w:sz w:val="19"/>
         </w:rPr>
         <w:br/>
+      </w:r>
+      <w:r>
+        <w:rPr>
+          <w:sz w:val="19"/>
+        </w:rPr>
         <w:t xml:space="preserve"> Until one is chosen, </w:t>
       </w:r>
       <w:r>
@@ -9194,6 +9247,8 @@
             </w:r>
             <w:r>
               <w:br/>
+            </w:r>
+            <w:r>
               <w:t>in our schema; accrual pulls</w:t>
             </w:r>
           </w:p>

</xml_diff>